<commit_message>
docs(competitors): update Signavio/ARIS/PRIME analysis to rev 3 (7 Jul 2026)
Add Compliance Monitoring (org-wide control effectiveness over time), org-wide
RCM numbering + Org Owner, and RCM analytics/highlight to the Diagramatix vs
SAP Signavio / ARIS / PRIME BPM comparison. New capability rows, refreshed
executive summary, leads, gaps and positioning; .docx regenerated via pandoc.

Co-Authored-By: Claude Opus 4.8 <noreply@anthropic.com>
</commit_message>
<xml_diff>
--- a/competitors/diagramatix-vs-signavio-aris-primebpm-2026-07.docx
+++ b/competitors/diagramatix-vs-signavio-aris-primebpm-2026-07.docx
@@ -2,13 +2,13 @@
 <file path=word/document.xml><?xml version="1.0" encoding="utf-8"?>
 <w:document xmlns:w="http://schemas.openxmlformats.org/wordprocessingml/2006/main" xmlns:m="http://schemas.openxmlformats.org/officeDocument/2006/math" xmlns:r="http://schemas.openxmlformats.org/officeDocument/2006/relationships" xmlns:o="urn:schemas-microsoft-com:office:office" xmlns:v="urn:schemas-microsoft-com:vml" xmlns:w10="urn:schemas-microsoft-com:office:word" xmlns:a="http://schemas.openxmlformats.org/drawingml/2006/main" xmlns:pic="http://schemas.openxmlformats.org/drawingml/2006/picture" xmlns:wp="http://schemas.openxmlformats.org/drawingml/2006/wordprocessingDrawing">
   <w:body>
-    <w:bookmarkStart w:id="18" w:name="X7f33d1d8547d3db6aac1006f6504c8981455714"/>
+    <w:bookmarkStart w:id="19" w:name="X31021a1797a56f2efb3f802f283a82334e8a0d1"/>
     <w:p>
       <w:pPr>
         <w:pStyle w:val="Heading1"/>
       </w:pPr>
       <w:r>
-        <w:t xml:space="preserve">Diagramatix Feature Comparison — July 2026 (rev 2)</w:t>
+        <w:t xml:space="preserve">Diagramatix Feature Comparison — July 2026 (rev 3)</w:t>
       </w:r>
     </w:p>
     <w:bookmarkStart w:id="9" w:name="X40bfa75883298e912b1b0b744ef0242ee75b805"/>
@@ -35,7 +35,7 @@
         <w:t xml:space="preserve"> </w:t>
       </w:r>
       <w:r>
-        <w:t xml:space="preserve">5 July 2026</w:t>
+        <w:t xml:space="preserve">7 July 2026</w:t>
       </w:r>
       <w:r>
         <w:t xml:space="preserve"> </w:t>
@@ -51,7 +51,7 @@
         <w:t xml:space="preserve"> </w:t>
       </w:r>
       <w:r>
-        <w:t xml:space="preserve">the 4 July 2026 refresh (which itself superseded the 21 June edition)</w:t>
+        <w:t xml:space="preserve">the 5 July 2026 edition (rev 2) — which superseded the 4 July refresh and the 21 June edition</w:t>
       </w:r>
       <w:r>
         <w:t xml:space="preserve"> </w:t>
@@ -104,13 +104,13 @@
       </w:r>
     </w:p>
     <w:bookmarkEnd w:id="9"/>
-    <w:bookmarkStart w:id="10" w:name="what-changed-since-the-last-refresh"/>
+    <w:bookmarkStart w:id="10" w:name="X647fdb4e345d24d5a5c7e95282f780678929a39"/>
     <w:p>
       <w:pPr>
         <w:pStyle w:val="Heading2"/>
       </w:pPr>
       <w:r>
-        <w:t xml:space="preserve">What changed since the last refresh</w:t>
+        <w:t xml:space="preserve">Update — 7 July 2026 (rev 3): continuous, org-wide compliance monitoring</w:t>
       </w:r>
     </w:p>
     <w:p>
@@ -118,55 +118,20 @@
         <w:pStyle w:val="FirstParagraph"/>
       </w:pPr>
       <w:r>
-        <w:t xml:space="preserve">The 21 June comparison called out</w:t>
-      </w:r>
-      <w:r>
-        <w:t xml:space="preserve"> </w:t>
-      </w:r>
-      <w:r>
-        <w:rPr>
-          <w:b/>
-          <w:bCs/>
-        </w:rPr>
-        <w:t xml:space="preserve">process mining/conformance</w:t>
-      </w:r>
-      <w:r>
-        <w:t xml:space="preserve"> </w:t>
-      </w:r>
-      <w:r>
-        <w:t xml:space="preserve">as Diagramatix’s clearest gap; the 4 July refresh closed it. Since then Diagramatix has also shipped the</w:t>
-      </w:r>
-      <w:r>
-        <w:t xml:space="preserve"> </w:t>
-      </w:r>
-      <w:r>
-        <w:rPr>
-          <w:i/>
-          <w:iCs/>
-        </w:rPr>
-        <w:t xml:space="preserve">other</w:t>
-      </w:r>
-      <w:r>
-        <w:t xml:space="preserve"> </w:t>
-      </w:r>
-      <w:r>
-        <w:t xml:space="preserve">historically-missing enterprise pillar —</w:t>
-      </w:r>
-      <w:r>
-        <w:t xml:space="preserve"> </w:t>
-      </w:r>
-      <w:r>
-        <w:rPr>
-          <w:b/>
-          <w:bCs/>
-        </w:rPr>
-        <w:t xml:space="preserve">Risk &amp; Compliance / GRC</w:t>
-      </w:r>
-      <w:r>
-        <w:t xml:space="preserve"> </w:t>
-      </w:r>
-      <w:r>
-        <w:t xml:space="preserve">— and, critically, wired it to the mining engine:</w:t>
+        <w:t xml:space="preserve">Since the 5 July edition, Diagramatix extended GRC from a point-in-time matrix to</w:t>
+      </w:r>
+      <w:r>
+        <w:t xml:space="preserve"> </w:t>
+      </w:r>
+      <w:r>
+        <w:rPr>
+          <w:b/>
+          <w:bCs/>
+        </w:rPr>
+        <w:t xml:space="preserve">continuous, organisation-wide compliance monitoring</w:t>
+      </w:r>
+      <w:r>
+        <w:t xml:space="preserve">:</w:t>
       </w:r>
     </w:p>
     <w:p>
@@ -182,29 +147,103 @@
           <w:b/>
           <w:bCs/>
         </w:rPr>
-        <w:t xml:space="preserve">Risk &amp; Control on the process model.</w:t>
-      </w:r>
-      <w:r>
-        <w:t xml:space="preserve"> </w:t>
-      </w:r>
-      <w:r>
-        <w:t xml:space="preserve">Attach</w:t>
-      </w:r>
-      <w:r>
-        <w:t xml:space="preserve"> </w:t>
-      </w:r>
-      <w:r>
-        <w:rPr>
-          <w:b/>
-          <w:bCs/>
-        </w:rPr>
-        <w:t xml:space="preserve">Risks and Controls</w:t>
-      </w:r>
-      <w:r>
-        <w:t xml:space="preserve"> </w:t>
-      </w:r>
-      <w:r>
-        <w:t xml:space="preserve">(and Policies, Regulations, Audit Findings, KRIs, KPIs) to the real process steps, from an org-master catalog each project adopts. Controls carry type (preventive/detective/corrective), automation (manual/automated/IT-dependent), owner, framework reference, evidence, test method and residual-risk rating.</w:t>
+        <w:t xml:space="preserve">Compliance Monitoring console.</w:t>
+      </w:r>
+      <w:r>
+        <w:t xml:space="preserve"> </w:t>
+      </w:r>
+      <w:r>
+        <w:t xml:space="preserve">A new</w:t>
+      </w:r>
+      <w:r>
+        <w:t xml:space="preserve"> </w:t>
+      </w:r>
+      <w:r>
+        <w:rPr>
+          <w:b/>
+          <w:bCs/>
+        </w:rPr>
+        <w:t xml:space="preserve">org-level</w:t>
+      </w:r>
+      <w:r>
+        <w:t xml:space="preserve"> </w:t>
+      </w:r>
+      <w:r>
+        <w:t xml:space="preserve">console (a peer of the Simulator, Miner and Risk &amp; Control screens) that trends</w:t>
+      </w:r>
+      <w:r>
+        <w:t xml:space="preserve"> </w:t>
+      </w:r>
+      <w:r>
+        <w:rPr>
+          <w:b/>
+          <w:bCs/>
+        </w:rPr>
+        <w:t xml:space="preserve">control operating-effectiveness over time</w:t>
+      </w:r>
+      <w:r>
+        <w:t xml:space="preserve"> </w:t>
+      </w:r>
+      <w:r>
+        <w:t xml:space="preserve">across</w:t>
+      </w:r>
+      <w:r>
+        <w:t xml:space="preserve"> </w:t>
+      </w:r>
+      <w:r>
+        <w:rPr>
+          <w:i/>
+          <w:iCs/>
+        </w:rPr>
+        <w:t xml:space="preserve">every</w:t>
+      </w:r>
+      <w:r>
+        <w:t xml:space="preserve"> </w:t>
+      </w:r>
+      <w:r>
+        <w:t xml:space="preserve">project in the organisation, assembled from the retained process-mining runs. It shows an org-wide</w:t>
+      </w:r>
+      <w:r>
+        <w:t xml:space="preserve"> </w:t>
+      </w:r>
+      <w:r>
+        <w:rPr>
+          <w:b/>
+          <w:bCs/>
+        </w:rPr>
+        <w:t xml:space="preserve">effectiveness-vs-conformance-fitness trend</w:t>
+      </w:r>
+      <w:r>
+        <w:t xml:space="preserve">, per-control trend charts,</w:t>
+      </w:r>
+      <w:r>
+        <w:t xml:space="preserve"> </w:t>
+      </w:r>
+      <w:r>
+        <w:rPr>
+          <w:b/>
+          <w:bCs/>
+        </w:rPr>
+        <w:t xml:space="preserve">below-threshold and declining-control alerts</w:t>
+      </w:r>
+      <w:r>
+        <w:t xml:space="preserve">, and a by-project posture table — with per-run</w:t>
+      </w:r>
+      <w:r>
+        <w:t xml:space="preserve"> </w:t>
+      </w:r>
+      <w:r>
+        <w:rPr>
+          <w:b/>
+          <w:bCs/>
+        </w:rPr>
+        <w:t xml:space="preserve">include/exclude</w:t>
+      </w:r>
+      <w:r>
+        <w:t xml:space="preserve"> </w:t>
+      </w:r>
+      <w:r>
+        <w:t xml:space="preserve">so throwaway/test runs don’t skew the trend.</w:t>
       </w:r>
     </w:p>
     <w:p>
@@ -220,45 +259,66 @@
           <w:b/>
           <w:bCs/>
         </w:rPr>
-        <w:t xml:space="preserve">Risk-Control Matrix (RCM) export.</w:t>
-      </w:r>
-      <w:r>
-        <w:t xml:space="preserve"> </w:t>
-      </w:r>
-      <w:r>
-        <w:t xml:space="preserve">One click produces the auditor-standard, flat</w:t>
-      </w:r>
-      <w:r>
-        <w:t xml:space="preserve"> </w:t>
-      </w:r>
-      <w:r>
-        <w:rPr>
-          <w:b/>
-          <w:bCs/>
-        </w:rPr>
-        <w:t xml:space="preserve">Activity × Risk × Control</w:t>
-      </w:r>
-      <w:r>
-        <w:t xml:space="preserve"> </w:t>
-      </w:r>
-      <w:r>
-        <w:t xml:space="preserve">grid (plus registers, a coverage summary and a full</w:t>
-      </w:r>
-      <w:r>
-        <w:t xml:space="preserve"> </w:t>
-      </w:r>
-      <w:r>
-        <w:rPr>
-          <w:b/>
-          <w:bCs/>
-        </w:rPr>
-        <w:t xml:space="preserve">traceability</w:t>
-      </w:r>
-      <w:r>
-        <w:t xml:space="preserve"> </w:t>
-      </w:r>
-      <w:r>
-        <w:t xml:space="preserve">sheet), in Excel.</w:t>
+        <w:t xml:space="preserve">Org-wide Risk &amp; Control numbering + Org Owner.</w:t>
+      </w:r>
+      <w:r>
+        <w:t xml:space="preserve"> </w:t>
+      </w:r>
+      <w:r>
+        <w:t xml:space="preserve">Risk / Control / Policy codes (</w:t>
+      </w:r>
+      <w:r>
+        <w:rPr>
+          <w:rStyle w:val="VerbatimChar"/>
+        </w:rPr>
+        <w:t xml:space="preserve">R-001</w:t>
+      </w:r>
+      <w:r>
+        <w:t xml:space="preserve">,</w:t>
+      </w:r>
+      <w:r>
+        <w:t xml:space="preserve"> </w:t>
+      </w:r>
+      <w:r>
+        <w:rPr>
+          <w:rStyle w:val="VerbatimChar"/>
+        </w:rPr>
+        <w:t xml:space="preserve">C-001</w:t>
+      </w:r>
+      <w:r>
+        <w:t xml:space="preserve">…) are now a single</w:t>
+      </w:r>
+      <w:r>
+        <w:t xml:space="preserve"> </w:t>
+      </w:r>
+      <w:r>
+        <w:rPr>
+          <w:b/>
+          <w:bCs/>
+        </w:rPr>
+        <w:t xml:space="preserve">organisation-wide</w:t>
+      </w:r>
+      <w:r>
+        <w:t xml:space="preserve"> </w:t>
+      </w:r>
+      <w:r>
+        <w:t xml:space="preserve">sequence shared across all of an org’s projects, so the same control reads the same code everywhere. A SuperAdmin-settable</w:t>
+      </w:r>
+      <w:r>
+        <w:t xml:space="preserve"> </w:t>
+      </w:r>
+      <w:r>
+        <w:rPr>
+          <w:b/>
+          <w:bCs/>
+        </w:rPr>
+        <w:t xml:space="preserve">Org Owner</w:t>
+      </w:r>
+      <w:r>
+        <w:t xml:space="preserve"> </w:t>
+      </w:r>
+      <w:r>
+        <w:t xml:space="preserve">governs which organisation a project — and its numbering — belongs to.</w:t>
       </w:r>
     </w:p>
     <w:p>
@@ -274,89 +334,63 @@
           <w:b/>
           <w:bCs/>
         </w:rPr>
-        <w:t xml:space="preserve">Coverage + Segregation-of-Duties checks.</w:t>
-      </w:r>
-      <w:r>
-        <w:t xml:space="preserve"> </w:t>
-      </w:r>
-      <w:r>
-        <w:t xml:space="preserve">The diagram scan flags a Risk with no mitigating Control, and a lane that both raises and approves the same work.</w:t>
-      </w:r>
-    </w:p>
-    <w:p>
-      <w:pPr>
-        <w:pStyle w:val="Compact"/>
-        <w:numPr>
-          <w:ilvl w:val="0"/>
-          <w:numId w:val="1001"/>
-        </w:numPr>
-      </w:pPr>
-      <w:r>
-        <w:rPr>
-          <w:b/>
-          <w:bCs/>
-        </w:rPr>
-        <w:t xml:space="preserve">Traceability graph.</w:t>
-      </w:r>
-      <w:r>
-        <w:t xml:space="preserve"> </w:t>
-      </w:r>
-      <w:r>
-        <w:t xml:space="preserve">A directed</w:t>
-      </w:r>
-      <w:r>
-        <w:t xml:space="preserve"> </w:t>
-      </w:r>
-      <w:r>
-        <w:rPr>
-          <w:b/>
-          <w:bCs/>
-        </w:rPr>
-        <w:t xml:space="preserve">activity → risk → control → policy → regulation</w:t>
-      </w:r>
-      <w:r>
-        <w:t xml:space="preserve"> </w:t>
-      </w:r>
-      <w:r>
-        <w:t xml:space="preserve">(with KRIs/KPIs) graph, exportable — end-to-end from a BPMN step to the controls and regulations that govern it.</w:t>
-      </w:r>
-    </w:p>
-    <w:p>
-      <w:pPr>
-        <w:pStyle w:val="Compact"/>
-        <w:numPr>
-          <w:ilvl w:val="0"/>
-          <w:numId w:val="1001"/>
-        </w:numPr>
-      </w:pPr>
-      <w:r>
-        <w:rPr>
-          <w:b/>
-          <w:bCs/>
-        </w:rPr>
-        <w:t xml:space="preserve">Control operating-effectiveness from mined data.</w:t>
-      </w:r>
-      <w:r>
-        <w:t xml:space="preserve"> </w:t>
-      </w:r>
-      <w:r>
-        <w:t xml:space="preserve">Tie a Control to the mining-conformance deviation a bypass would produce, and the RCM shows it was</w:t>
-      </w:r>
-      <w:r>
-        <w:t xml:space="preserve"> </w:t>
-      </w:r>
-      <w:r>
-        <w:rPr>
-          <w:b/>
-          <w:bCs/>
-        </w:rPr>
-        <w:t xml:space="preserve">“bypassed in N of M cases”</w:t>
-      </w:r>
-      <w:r>
-        <w:t xml:space="preserve"> </w:t>
-      </w:r>
-      <w:r>
-        <w:t xml:space="preserve">— evidence the control is actually</w:t>
+        <w:t xml:space="preserve">RCM analytics + on-model highlight.</w:t>
+      </w:r>
+      <w:r>
+        <w:t xml:space="preserve"> </w:t>
+      </w:r>
+      <w:r>
+        <w:t xml:space="preserve">An in-console</w:t>
+      </w:r>
+      <w:r>
+        <w:t xml:space="preserve"> </w:t>
+      </w:r>
+      <w:r>
+        <w:rPr>
+          <w:b/>
+          <w:bCs/>
+        </w:rPr>
+        <w:t xml:space="preserve">analytics</w:t>
+      </w:r>
+      <w:r>
+        <w:t xml:space="preserve"> </w:t>
+      </w:r>
+      <w:r>
+        <w:t xml:space="preserve">view (coverage, inherent/residual risk posture, control type/automation mix, operating-effectiveness distribution) plus</w:t>
+      </w:r>
+      <w:r>
+        <w:t xml:space="preserve"> </w:t>
+      </w:r>
+      <w:r>
+        <w:rPr>
+          <w:b/>
+          <w:bCs/>
+        </w:rPr>
+        <w:t xml:space="preserve">red/green highlighting</w:t>
+      </w:r>
+      <w:r>
+        <w:t xml:space="preserve"> </w:t>
+      </w:r>
+      <w:r>
+        <w:t xml:space="preserve">of risk- and control-carrying steps directly on the diagram, and one-click navigation from a control to the exact step it guards.</w:t>
+      </w:r>
+    </w:p>
+    <w:p>
+      <w:pPr>
+        <w:pStyle w:val="FirstParagraph"/>
+      </w:pPr>
+      <w:r>
+        <w:rPr>
+          <w:b/>
+          <w:bCs/>
+        </w:rPr>
+        <w:t xml:space="preserve">Net effect:</w:t>
+      </w:r>
+      <w:r>
+        <w:t xml:space="preserve"> </w:t>
+      </w:r>
+      <w:r>
+        <w:t xml:space="preserve">the governance story moves from</w:t>
       </w:r>
       <w:r>
         <w:t xml:space="preserve"> </w:t>
@@ -366,32 +400,13 @@
           <w:i/>
           <w:iCs/>
         </w:rPr>
-        <w:t xml:space="preserve">operating</w:t>
-      </w:r>
-      <w:r>
-        <w:t xml:space="preserve">, computed from the real event log.</w:t>
-      </w:r>
-    </w:p>
-    <w:p>
-      <w:pPr>
-        <w:pStyle w:val="Compact"/>
-        <w:numPr>
-          <w:ilvl w:val="0"/>
-          <w:numId w:val="1001"/>
-        </w:numPr>
-      </w:pPr>
-      <w:r>
-        <w:rPr>
-          <w:b/>
-          <w:bCs/>
-        </w:rPr>
-        <w:t xml:space="preserve">A 3rd example catalog</w:t>
-      </w:r>
-      <w:r>
-        <w:t xml:space="preserve"> </w:t>
-      </w:r>
-      <w:r>
-        <w:t xml:space="preserve">—</w:t>
+        <w:t xml:space="preserve">“produce a Risk-Control Matrix”</w:t>
+      </w:r>
+      <w:r>
+        <w:t xml:space="preserve"> </w:t>
+      </w:r>
+      <w:r>
+        <w:t xml:space="preserve">to</w:t>
       </w:r>
       <w:r>
         <w:t xml:space="preserve"> </w:t>
@@ -401,62 +416,45 @@
           <w:i/>
           <w:iCs/>
         </w:rPr>
-        <w:t xml:space="preserve">Risk &amp; Control (GRC) Examples</w:t>
-      </w:r>
-      <w:r>
-        <w:t xml:space="preserve"> </w:t>
-      </w:r>
-      <w:r>
-        <w:t xml:space="preserve">— parallel to the Simulator and Mining galleries, with a one-click Order-to-Cash study (real process + risks/controls + a mined run proving effectiveness).</w:t>
-      </w:r>
-    </w:p>
-    <w:p>
-      <w:pPr>
-        <w:pStyle w:val="FirstParagraph"/>
-      </w:pPr>
-      <w:r>
-        <w:t xml:space="preserve">Net effect: Diagramatix now spans</w:t>
-      </w:r>
-      <w:r>
-        <w:t xml:space="preserve"> </w:t>
-      </w:r>
-      <w:r>
-        <w:rPr>
-          <w:b/>
-          <w:bCs/>
-        </w:rPr>
-        <w:t xml:space="preserve">model → publish → mine → conform → simulate → govern → improve</w:t>
-      </w:r>
-      <w:r>
-        <w:t xml:space="preserve"> </w:t>
-      </w:r>
-      <w:r>
-        <w:t xml:space="preserve">in one workspace. The two capabilities that used to be</w:t>
-      </w:r>
-      <w:r>
-        <w:t xml:space="preserve"> </w:t>
-      </w:r>
-      <w:r>
-        <w:t xml:space="preserve">“enterprise-suite only”</w:t>
-      </w:r>
-      <w:r>
-        <w:t xml:space="preserve"> </w:t>
-      </w:r>
-      <w:r>
-        <w:t xml:space="preserve">— process mining and GRC — are both present</w:t>
-      </w:r>
-      <w:r>
-        <w:t xml:space="preserve"> </w:t>
-      </w:r>
-      <w:r>
-        <w:rPr>
-          <w:i/>
-          <w:iCs/>
-        </w:rPr>
-        <w:t xml:space="preserve">and integrated with each other</w:t>
-      </w:r>
-      <w:r>
-        <w:t xml:space="preserve">, which even the enterprise suites keep in separate products.</w:t>
+        <w:t xml:space="preserve">“monitor whether controls keep operating — organisation-wide, over time.”</w:t>
+      </w:r>
+      <w:r>
+        <w:t xml:space="preserve"> </w:t>
+      </w:r>
+      <w:r>
+        <w:t xml:space="preserve">This begins to close the previously-noted</w:t>
+      </w:r>
+      <w:r>
+        <w:t xml:space="preserve"> </w:t>
+      </w:r>
+      <w:r>
+        <w:rPr>
+          <w:b/>
+          <w:bCs/>
+        </w:rPr>
+        <w:t xml:space="preserve">org-wide analytics</w:t>
+      </w:r>
+      <w:r>
+        <w:t xml:space="preserve"> </w:t>
+      </w:r>
+      <w:r>
+        <w:t xml:space="preserve">gap for the</w:t>
+      </w:r>
+      <w:r>
+        <w:t xml:space="preserve"> </w:t>
+      </w:r>
+      <w:r>
+        <w:rPr>
+          <w:b/>
+          <w:bCs/>
+        </w:rPr>
+        <w:t xml:space="preserve">compliance</w:t>
+      </w:r>
+      <w:r>
+        <w:t xml:space="preserve"> </w:t>
+      </w:r>
+      <w:r>
+        <w:t xml:space="preserve">domain specifically (control-effectiveness trending across projects) — a capability the enterprise suites deliver only by combining a separate process-intelligence product with a separate GRC product.</w:t>
       </w:r>
     </w:p>
     <w:p>
@@ -467,13 +465,13 @@
       </w:r>
     </w:p>
     <w:bookmarkEnd w:id="10"/>
-    <w:bookmarkStart w:id="11" w:name="basis-of-comparison"/>
+    <w:bookmarkStart w:id="11" w:name="X56b099fa31e9f47fe03cd0e7033c7a6a1668206"/>
     <w:p>
       <w:pPr>
         <w:pStyle w:val="Heading2"/>
       </w:pPr>
       <w:r>
-        <w:t xml:space="preserve">Basis of comparison</w:t>
+        <w:t xml:space="preserve">Earlier context — the GRC addition (5 July 2026)</w:t>
       </w:r>
     </w:p>
     <w:p>
@@ -481,20 +479,55 @@
         <w:pStyle w:val="FirstParagraph"/>
       </w:pPr>
       <w:r>
-        <w:t xml:space="preserve">The Diagramatix side is grounded in the shipped feature catalogue. The comparator side is based on public product pages and documentation — this is a</w:t>
-      </w:r>
-      <w:r>
-        <w:t xml:space="preserve"> </w:t>
-      </w:r>
-      <w:r>
-        <w:rPr>
-          <w:b/>
-          <w:bCs/>
-        </w:rPr>
-        <w:t xml:space="preserve">public-document comparison, not a hands-on bake-off</w:t>
-      </w:r>
-      <w:r>
-        <w:t xml:space="preserve">:</w:t>
+        <w:t xml:space="preserve">The 21 June comparison called out</w:t>
+      </w:r>
+      <w:r>
+        <w:t xml:space="preserve"> </w:t>
+      </w:r>
+      <w:r>
+        <w:rPr>
+          <w:b/>
+          <w:bCs/>
+        </w:rPr>
+        <w:t xml:space="preserve">process mining/conformance</w:t>
+      </w:r>
+      <w:r>
+        <w:t xml:space="preserve"> </w:t>
+      </w:r>
+      <w:r>
+        <w:t xml:space="preserve">as Diagramatix’s clearest gap; the 4 July refresh closed it. Since then Diagramatix has also shipped the</w:t>
+      </w:r>
+      <w:r>
+        <w:t xml:space="preserve"> </w:t>
+      </w:r>
+      <w:r>
+        <w:rPr>
+          <w:i/>
+          <w:iCs/>
+        </w:rPr>
+        <w:t xml:space="preserve">other</w:t>
+      </w:r>
+      <w:r>
+        <w:t xml:space="preserve"> </w:t>
+      </w:r>
+      <w:r>
+        <w:t xml:space="preserve">historically-missing enterprise pillar —</w:t>
+      </w:r>
+      <w:r>
+        <w:t xml:space="preserve"> </w:t>
+      </w:r>
+      <w:r>
+        <w:rPr>
+          <w:b/>
+          <w:bCs/>
+        </w:rPr>
+        <w:t xml:space="preserve">Risk &amp; Compliance / GRC</w:t>
+      </w:r>
+      <w:r>
+        <w:t xml:space="preserve"> </w:t>
+      </w:r>
+      <w:r>
+        <w:t xml:space="preserve">— and, critically, wired it to the mining engine:</w:t>
       </w:r>
     </w:p>
     <w:p>
@@ -510,13 +543,29 @@
           <w:b/>
           <w:bCs/>
         </w:rPr>
-        <w:t xml:space="preserve">Strong</w:t>
-      </w:r>
-      <w:r>
-        <w:t xml:space="preserve"> </w:t>
-      </w:r>
-      <w:r>
-        <w:t xml:space="preserve">— clear public evidence of a matching or very close capability.</w:t>
+        <w:t xml:space="preserve">Risk &amp; Control on the process model.</w:t>
+      </w:r>
+      <w:r>
+        <w:t xml:space="preserve"> </w:t>
+      </w:r>
+      <w:r>
+        <w:t xml:space="preserve">Attach</w:t>
+      </w:r>
+      <w:r>
+        <w:t xml:space="preserve"> </w:t>
+      </w:r>
+      <w:r>
+        <w:rPr>
+          <w:b/>
+          <w:bCs/>
+        </w:rPr>
+        <w:t xml:space="preserve">Risks and Controls</w:t>
+      </w:r>
+      <w:r>
+        <w:t xml:space="preserve"> </w:t>
+      </w:r>
+      <w:r>
+        <w:t xml:space="preserve">(and Policies, Regulations, Audit Findings, KRIs, KPIs) to the real process steps, from an org-master catalog each project adopts. Controls carry type (preventive/detective/corrective), automation (manual/automated/IT-dependent), owner, framework reference, evidence, test method and residual-risk rating.</w:t>
       </w:r>
     </w:p>
     <w:p>
@@ -532,13 +581,45 @@
           <w:b/>
           <w:bCs/>
         </w:rPr>
-        <w:t xml:space="preserve">Partial</w:t>
-      </w:r>
-      <w:r>
-        <w:t xml:space="preserve"> </w:t>
-      </w:r>
-      <w:r>
-        <w:t xml:space="preserve">— an adjacent capability, but not the exact Diagramatix feature as described.</w:t>
+        <w:t xml:space="preserve">Risk-Control Matrix (RCM) export.</w:t>
+      </w:r>
+      <w:r>
+        <w:t xml:space="preserve"> </w:t>
+      </w:r>
+      <w:r>
+        <w:t xml:space="preserve">One click produces the auditor-standard, flat</w:t>
+      </w:r>
+      <w:r>
+        <w:t xml:space="preserve"> </w:t>
+      </w:r>
+      <w:r>
+        <w:rPr>
+          <w:b/>
+          <w:bCs/>
+        </w:rPr>
+        <w:t xml:space="preserve">Activity × Risk × Control</w:t>
+      </w:r>
+      <w:r>
+        <w:t xml:space="preserve"> </w:t>
+      </w:r>
+      <w:r>
+        <w:t xml:space="preserve">grid (plus registers, a coverage summary and a full</w:t>
+      </w:r>
+      <w:r>
+        <w:t xml:space="preserve"> </w:t>
+      </w:r>
+      <w:r>
+        <w:rPr>
+          <w:b/>
+          <w:bCs/>
+        </w:rPr>
+        <w:t xml:space="preserve">traceability</w:t>
+      </w:r>
+      <w:r>
+        <w:t xml:space="preserve"> </w:t>
+      </w:r>
+      <w:r>
+        <w:t xml:space="preserve">sheet), in Excel.</w:t>
       </w:r>
     </w:p>
     <w:p>
@@ -554,29 +635,189 @@
           <w:b/>
           <w:bCs/>
         </w:rPr>
-        <w:t xml:space="preserve">Not found</w:t>
-      </w:r>
-      <w:r>
-        <w:t xml:space="preserve"> </w:t>
-      </w:r>
-      <w:r>
-        <w:t xml:space="preserve">— no reliable public evidence for that exact feature (this does</w:t>
-      </w:r>
-      <w:r>
-        <w:t xml:space="preserve"> </w:t>
-      </w:r>
-      <w:r>
-        <w:rPr>
-          <w:b/>
-          <w:bCs/>
-        </w:rPr>
-        <w:t xml:space="preserve">not</w:t>
-      </w:r>
-      <w:r>
-        <w:t xml:space="preserve"> </w:t>
-      </w:r>
-      <w:r>
-        <w:t xml:space="preserve">prove absence).</w:t>
+        <w:t xml:space="preserve">Coverage + Segregation-of-Duties checks.</w:t>
+      </w:r>
+      <w:r>
+        <w:t xml:space="preserve"> </w:t>
+      </w:r>
+      <w:r>
+        <w:t xml:space="preserve">The diagram scan flags a Risk with no mitigating Control, and a lane that both raises and approves the same work.</w:t>
+      </w:r>
+    </w:p>
+    <w:p>
+      <w:pPr>
+        <w:pStyle w:val="Compact"/>
+        <w:numPr>
+          <w:ilvl w:val="0"/>
+          <w:numId w:val="1002"/>
+        </w:numPr>
+      </w:pPr>
+      <w:r>
+        <w:rPr>
+          <w:b/>
+          <w:bCs/>
+        </w:rPr>
+        <w:t xml:space="preserve">Traceability graph.</w:t>
+      </w:r>
+      <w:r>
+        <w:t xml:space="preserve"> </w:t>
+      </w:r>
+      <w:r>
+        <w:t xml:space="preserve">A directed</w:t>
+      </w:r>
+      <w:r>
+        <w:t xml:space="preserve"> </w:t>
+      </w:r>
+      <w:r>
+        <w:rPr>
+          <w:b/>
+          <w:bCs/>
+        </w:rPr>
+        <w:t xml:space="preserve">activity → risk → control → policy → regulation</w:t>
+      </w:r>
+      <w:r>
+        <w:t xml:space="preserve"> </w:t>
+      </w:r>
+      <w:r>
+        <w:t xml:space="preserve">(with KRIs/KPIs) graph, exportable — end-to-end from a BPMN step to the controls and regulations that govern it.</w:t>
+      </w:r>
+    </w:p>
+    <w:p>
+      <w:pPr>
+        <w:pStyle w:val="Compact"/>
+        <w:numPr>
+          <w:ilvl w:val="0"/>
+          <w:numId w:val="1002"/>
+        </w:numPr>
+      </w:pPr>
+      <w:r>
+        <w:rPr>
+          <w:b/>
+          <w:bCs/>
+        </w:rPr>
+        <w:t xml:space="preserve">Control operating-effectiveness from mined data.</w:t>
+      </w:r>
+      <w:r>
+        <w:t xml:space="preserve"> </w:t>
+      </w:r>
+      <w:r>
+        <w:t xml:space="preserve">Tie a Control to the mining-conformance deviation a bypass would produce, and the RCM shows it was</w:t>
+      </w:r>
+      <w:r>
+        <w:t xml:space="preserve"> </w:t>
+      </w:r>
+      <w:r>
+        <w:rPr>
+          <w:b/>
+          <w:bCs/>
+        </w:rPr>
+        <w:t xml:space="preserve">“bypassed in N of M cases”</w:t>
+      </w:r>
+      <w:r>
+        <w:t xml:space="preserve"> </w:t>
+      </w:r>
+      <w:r>
+        <w:t xml:space="preserve">— evidence the control is actually</w:t>
+      </w:r>
+      <w:r>
+        <w:t xml:space="preserve"> </w:t>
+      </w:r>
+      <w:r>
+        <w:rPr>
+          <w:i/>
+          <w:iCs/>
+        </w:rPr>
+        <w:t xml:space="preserve">operating</w:t>
+      </w:r>
+      <w:r>
+        <w:t xml:space="preserve">, computed from the real event log.</w:t>
+      </w:r>
+    </w:p>
+    <w:p>
+      <w:pPr>
+        <w:pStyle w:val="Compact"/>
+        <w:numPr>
+          <w:ilvl w:val="0"/>
+          <w:numId w:val="1002"/>
+        </w:numPr>
+      </w:pPr>
+      <w:r>
+        <w:rPr>
+          <w:b/>
+          <w:bCs/>
+        </w:rPr>
+        <w:t xml:space="preserve">A 3rd example catalog</w:t>
+      </w:r>
+      <w:r>
+        <w:t xml:space="preserve"> </w:t>
+      </w:r>
+      <w:r>
+        <w:t xml:space="preserve">—</w:t>
+      </w:r>
+      <w:r>
+        <w:t xml:space="preserve"> </w:t>
+      </w:r>
+      <w:r>
+        <w:rPr>
+          <w:i/>
+          <w:iCs/>
+        </w:rPr>
+        <w:t xml:space="preserve">Risk &amp; Control (GRC) Examples</w:t>
+      </w:r>
+      <w:r>
+        <w:t xml:space="preserve"> </w:t>
+      </w:r>
+      <w:r>
+        <w:t xml:space="preserve">— parallel to the Simulator and Mining galleries, with a one-click Order-to-Cash study (real process + risks/controls + a mined run proving effectiveness).</w:t>
+      </w:r>
+    </w:p>
+    <w:p>
+      <w:pPr>
+        <w:pStyle w:val="FirstParagraph"/>
+      </w:pPr>
+      <w:r>
+        <w:t xml:space="preserve">Net effect: Diagramatix now spans</w:t>
+      </w:r>
+      <w:r>
+        <w:t xml:space="preserve"> </w:t>
+      </w:r>
+      <w:r>
+        <w:rPr>
+          <w:b/>
+          <w:bCs/>
+        </w:rPr>
+        <w:t xml:space="preserve">model → publish → mine → conform → simulate → govern → improve</w:t>
+      </w:r>
+      <w:r>
+        <w:t xml:space="preserve"> </w:t>
+      </w:r>
+      <w:r>
+        <w:t xml:space="preserve">in one workspace. The two capabilities that used to be</w:t>
+      </w:r>
+      <w:r>
+        <w:t xml:space="preserve"> </w:t>
+      </w:r>
+      <w:r>
+        <w:t xml:space="preserve">“enterprise-suite only”</w:t>
+      </w:r>
+      <w:r>
+        <w:t xml:space="preserve"> </w:t>
+      </w:r>
+      <w:r>
+        <w:t xml:space="preserve">— process mining and GRC — are both present</w:t>
+      </w:r>
+      <w:r>
+        <w:t xml:space="preserve"> </w:t>
+      </w:r>
+      <w:r>
+        <w:rPr>
+          <w:i/>
+          <w:iCs/>
+        </w:rPr>
+        <w:t xml:space="preserve">and integrated with each other</w:t>
+      </w:r>
+      <w:r>
+        <w:t xml:space="preserve">, which even the enterprise suites keep in separate products.</w:t>
       </w:r>
     </w:p>
     <w:p>
@@ -587,13 +828,13 @@
       </w:r>
     </w:p>
     <w:bookmarkEnd w:id="11"/>
-    <w:bookmarkStart w:id="12" w:name="executive-summary"/>
+    <w:bookmarkStart w:id="12" w:name="basis-of-comparison"/>
     <w:p>
       <w:pPr>
         <w:pStyle w:val="Heading2"/>
       </w:pPr>
       <w:r>
-        <w:t xml:space="preserve">Executive summary</w:t>
+        <w:t xml:space="preserve">Basis of comparison</w:t>
       </w:r>
     </w:p>
     <w:p>
@@ -601,60 +842,20 @@
         <w:pStyle w:val="FirstParagraph"/>
       </w:pPr>
       <w:r>
-        <w:rPr>
-          <w:b/>
-          <w:bCs/>
-        </w:rPr>
-        <w:t xml:space="preserve">Diagramatix</w:t>
-      </w:r>
-      <w:r>
-        <w:t xml:space="preserve"> </w:t>
-      </w:r>
-      <w:r>
-        <w:t xml:space="preserve">is now a</w:t>
-      </w:r>
-      <w:r>
-        <w:t xml:space="preserve"> </w:t>
-      </w:r>
-      <w:r>
-        <w:rPr>
-          <w:b/>
-          <w:bCs/>
-        </w:rPr>
-        <w:t xml:space="preserve">full-loop process</w:t>
-      </w:r>
-      <w:r>
-        <w:rPr>
-          <w:b/>
-          <w:bCs/>
-        </w:rPr>
-        <w:t xml:space="preserve"> </w:t>
-      </w:r>
-      <w:r>
-        <w:rPr>
-          <w:b/>
-          <w:bCs/>
-          <w:i/>
-          <w:iCs/>
-        </w:rPr>
-        <w:t xml:space="preserve">and governance</w:t>
-      </w:r>
-      <w:r>
-        <w:rPr>
-          <w:b/>
-          <w:bCs/>
-        </w:rPr>
-        <w:t xml:space="preserve"> </w:t>
-      </w:r>
-      <w:r>
-        <w:rPr>
-          <w:b/>
-          <w:bCs/>
-        </w:rPr>
-        <w:t xml:space="preserve">platform for the SMB and mid-market</w:t>
-      </w:r>
-      <w:r>
-        <w:t xml:space="preserve">: author in any notation, publish to a business audience, mine the real process from event logs, check conformance, calibrate a digital twin, simulate the redesign — and govern it with risks, controls and a Risk-Control Matrix, all without leaving the tool. Its distinctive, hard-to-match claims are now:</w:t>
+        <w:t xml:space="preserve">The Diagramatix side is grounded in the shipped feature catalogue. The comparator side is based on public product pages and documentation — this is a</w:t>
+      </w:r>
+      <w:r>
+        <w:t xml:space="preserve"> </w:t>
+      </w:r>
+      <w:r>
+        <w:rPr>
+          <w:b/>
+          <w:bCs/>
+        </w:rPr>
+        <w:t xml:space="preserve">public-document comparison, not a hands-on bake-off</w:t>
+      </w:r>
+      <w:r>
+        <w:t xml:space="preserve">:</w:t>
       </w:r>
     </w:p>
     <w:p>
@@ -670,61 +871,13 @@
           <w:b/>
           <w:bCs/>
         </w:rPr>
-        <w:t xml:space="preserve">A closed mine → conform → simulate → improve loop in one product.</w:t>
-      </w:r>
-      <w:r>
-        <w:t xml:space="preserve"> </w:t>
-      </w:r>
-      <w:r>
-        <w:t xml:space="preserve">Most tools do</w:t>
-      </w:r>
-      <w:r>
-        <w:t xml:space="preserve"> </w:t>
-      </w:r>
-      <w:r>
-        <w:rPr>
-          <w:i/>
-          <w:iCs/>
-        </w:rPr>
-        <w:t xml:space="preserve">either</w:t>
-      </w:r>
-      <w:r>
-        <w:t xml:space="preserve"> </w:t>
-      </w:r>
-      <w:r>
-        <w:t xml:space="preserve">mining (Celonis, Signavio PI, ARIS Mining)</w:t>
-      </w:r>
-      <w:r>
-        <w:t xml:space="preserve"> </w:t>
-      </w:r>
-      <w:r>
-        <w:rPr>
-          <w:i/>
-          <w:iCs/>
-        </w:rPr>
-        <w:t xml:space="preserve">or</w:t>
-      </w:r>
-      <w:r>
-        <w:t xml:space="preserve"> </w:t>
-      </w:r>
-      <w:r>
-        <w:t xml:space="preserve">modelling+simulation (Signavio Modeler, ARIS, PRIME). Diagramatix does both and</w:t>
-      </w:r>
-      <w:r>
-        <w:t xml:space="preserve"> </w:t>
-      </w:r>
-      <w:r>
-        <w:rPr>
-          <w:b/>
-          <w:bCs/>
-        </w:rPr>
-        <w:t xml:space="preserve">wires mining output straight into a calibrated simulation twin</w:t>
-      </w:r>
-      <w:r>
-        <w:t xml:space="preserve"> </w:t>
-      </w:r>
-      <w:r>
-        <w:t xml:space="preserve">— a workflow even the enterprise suites keep in separate modules.</w:t>
+        <w:t xml:space="preserve">Strong</w:t>
+      </w:r>
+      <w:r>
+        <w:t xml:space="preserve"> </w:t>
+      </w:r>
+      <w:r>
+        <w:t xml:space="preserve">— clear public evidence of a matching or very close capability.</w:t>
       </w:r>
     </w:p>
     <w:p>
@@ -740,48 +893,13 @@
           <w:b/>
           <w:bCs/>
         </w:rPr>
-        <w:t xml:space="preserve">Governance on the process, proven by data.</w:t>
-      </w:r>
-      <w:r>
-        <w:t xml:space="preserve"> </w:t>
-      </w:r>
-      <w:r>
-        <w:t xml:space="preserve">Attach Risks &amp; Controls to the real steps, produce a Risk-Control Matrix, and — uniquely at this tier — see each control’s</w:t>
-      </w:r>
-      <w:r>
-        <w:t xml:space="preserve"> </w:t>
-      </w:r>
-      <w:r>
-        <w:rPr>
-          <w:b/>
-          <w:bCs/>
-        </w:rPr>
-        <w:t xml:space="preserve">operating effectiveness</w:t>
-      </w:r>
-      <w:r>
-        <w:t xml:space="preserve"> </w:t>
-      </w:r>
-      <w:r>
-        <w:t xml:space="preserve">(</w:t>
-      </w:r>
-      <w:r>
-        <w:t xml:space="preserve">“bypassed in N of M cases”</w:t>
-      </w:r>
-      <w:r>
-        <w:t xml:space="preserve">) computed from the</w:t>
-      </w:r>
-      <w:r>
-        <w:t xml:space="preserve"> </w:t>
-      </w:r>
-      <w:r>
-        <w:rPr>
-          <w:i/>
-          <w:iCs/>
-        </w:rPr>
-        <w:t xml:space="preserve">mined conformance</w:t>
-      </w:r>
-      <w:r>
-        <w:t xml:space="preserve">. Enterprise GRC suites keep risk/control and process mining in separate products; Diagramatix does both on one model.</w:t>
+        <w:t xml:space="preserve">Partial</w:t>
+      </w:r>
+      <w:r>
+        <w:t xml:space="preserve"> </w:t>
+      </w:r>
+      <w:r>
+        <w:t xml:space="preserve">— an adjacent capability, but not the exact Diagramatix feature as described.</w:t>
       </w:r>
     </w:p>
     <w:p>
@@ -797,42 +915,107 @@
           <w:b/>
           <w:bCs/>
         </w:rPr>
-        <w:t xml:space="preserve">Entity-lifecycle mining + state-machine conformance.</w:t>
-      </w:r>
-      <w:r>
-        <w:t xml:space="preserve"> </w:t>
-      </w:r>
-      <w:r>
-        <w:t xml:space="preserve">Beyond directly-follows BPMN discovery, Diagramatix mines the business entity’s</w:t>
-      </w:r>
-      <w:r>
-        <w:t xml:space="preserve"> </w:t>
-      </w:r>
-      <w:r>
-        <w:rPr>
-          <w:b/>
-          <w:bCs/>
-        </w:rPr>
-        <w:t xml:space="preserve">state machine</w:t>
-      </w:r>
-      <w:r>
-        <w:t xml:space="preserve"> </w:t>
-      </w:r>
-      <w:r>
-        <w:t xml:space="preserve">and replays it against a reference lifecycle — conformance framed as</w:t>
-      </w:r>
-      <w:r>
-        <w:t xml:space="preserve"> </w:t>
-      </w:r>
-      <w:r>
-        <w:rPr>
+        <w:t xml:space="preserve">Not found</w:t>
+      </w:r>
+      <w:r>
+        <w:t xml:space="preserve"> </w:t>
+      </w:r>
+      <w:r>
+        <w:t xml:space="preserve">— no reliable public evidence for that exact feature (this does</w:t>
+      </w:r>
+      <w:r>
+        <w:t xml:space="preserve"> </w:t>
+      </w:r>
+      <w:r>
+        <w:rPr>
+          <w:b/>
+          <w:bCs/>
+        </w:rPr>
+        <w:t xml:space="preserve">not</w:t>
+      </w:r>
+      <w:r>
+        <w:t xml:space="preserve"> </w:t>
+      </w:r>
+      <w:r>
+        <w:t xml:space="preserve">prove absence).</w:t>
+      </w:r>
+    </w:p>
+    <w:p>
+      <w:r>
+        <w:pict>
+          <v:rect style="width:0;height:1.5pt" o:hralign="center" o:hrstd="t" o:hr="t"/>
+        </w:pict>
+      </w:r>
+    </w:p>
+    <w:bookmarkEnd w:id="12"/>
+    <w:bookmarkStart w:id="13" w:name="executive-summary"/>
+    <w:p>
+      <w:pPr>
+        <w:pStyle w:val="Heading2"/>
+      </w:pPr>
+      <w:r>
+        <w:t xml:space="preserve">Executive summary</w:t>
+      </w:r>
+    </w:p>
+    <w:p>
+      <w:pPr>
+        <w:pStyle w:val="FirstParagraph"/>
+      </w:pPr>
+      <w:r>
+        <w:rPr>
+          <w:b/>
+          <w:bCs/>
+        </w:rPr>
+        <w:t xml:space="preserve">Diagramatix</w:t>
+      </w:r>
+      <w:r>
+        <w:t xml:space="preserve"> </w:t>
+      </w:r>
+      <w:r>
+        <w:t xml:space="preserve">is now a</w:t>
+      </w:r>
+      <w:r>
+        <w:t xml:space="preserve"> </w:t>
+      </w:r>
+      <w:r>
+        <w:rPr>
+          <w:b/>
+          <w:bCs/>
+        </w:rPr>
+        <w:t xml:space="preserve">full-loop process</w:t>
+      </w:r>
+      <w:r>
+        <w:rPr>
+          <w:b/>
+          <w:bCs/>
+        </w:rPr>
+        <w:t xml:space="preserve"> </w:t>
+      </w:r>
+      <w:r>
+        <w:rPr>
+          <w:b/>
+          <w:bCs/>
           <w:i/>
           <w:iCs/>
         </w:rPr>
-        <w:t xml:space="preserve">legal states/transitions</w:t>
-      </w:r>
-      <w:r>
-        <w:t xml:space="preserve">, unusually precise for this tier.</w:t>
+        <w:t xml:space="preserve">and governance</w:t>
+      </w:r>
+      <w:r>
+        <w:rPr>
+          <w:b/>
+          <w:bCs/>
+        </w:rPr>
+        <w:t xml:space="preserve"> </w:t>
+      </w:r>
+      <w:r>
+        <w:rPr>
+          <w:b/>
+          <w:bCs/>
+        </w:rPr>
+        <w:t xml:space="preserve">platform for the SMB and mid-market</w:t>
+      </w:r>
+      <w:r>
+        <w:t xml:space="preserve">: author in any notation, publish to a business audience, mine the real process from event logs, check conformance, calibrate a digital twin, simulate the redesign — and govern it with risks, controls and a Risk-Control Matrix, all without leaving the tool. Its distinctive, hard-to-match claims are now:</w:t>
       </w:r>
     </w:p>
     <w:p>
@@ -840,7 +1023,233 @@
         <w:pStyle w:val="Compact"/>
         <w:numPr>
           <w:ilvl w:val="0"/>
-          <w:numId w:val="1003"/>
+          <w:numId w:val="1004"/>
+        </w:numPr>
+      </w:pPr>
+      <w:r>
+        <w:rPr>
+          <w:b/>
+          <w:bCs/>
+        </w:rPr>
+        <w:t xml:space="preserve">A closed mine → conform → simulate → improve loop in one product.</w:t>
+      </w:r>
+      <w:r>
+        <w:t xml:space="preserve"> </w:t>
+      </w:r>
+      <w:r>
+        <w:t xml:space="preserve">Most tools do</w:t>
+      </w:r>
+      <w:r>
+        <w:t xml:space="preserve"> </w:t>
+      </w:r>
+      <w:r>
+        <w:rPr>
+          <w:i/>
+          <w:iCs/>
+        </w:rPr>
+        <w:t xml:space="preserve">either</w:t>
+      </w:r>
+      <w:r>
+        <w:t xml:space="preserve"> </w:t>
+      </w:r>
+      <w:r>
+        <w:t xml:space="preserve">mining (Celonis, Signavio PI, ARIS Mining)</w:t>
+      </w:r>
+      <w:r>
+        <w:t xml:space="preserve"> </w:t>
+      </w:r>
+      <w:r>
+        <w:rPr>
+          <w:i/>
+          <w:iCs/>
+        </w:rPr>
+        <w:t xml:space="preserve">or</w:t>
+      </w:r>
+      <w:r>
+        <w:t xml:space="preserve"> </w:t>
+      </w:r>
+      <w:r>
+        <w:t xml:space="preserve">modelling+simulation (Signavio Modeler, ARIS, PRIME). Diagramatix does both and</w:t>
+      </w:r>
+      <w:r>
+        <w:t xml:space="preserve"> </w:t>
+      </w:r>
+      <w:r>
+        <w:rPr>
+          <w:b/>
+          <w:bCs/>
+        </w:rPr>
+        <w:t xml:space="preserve">wires mining output straight into a calibrated simulation twin</w:t>
+      </w:r>
+      <w:r>
+        <w:t xml:space="preserve"> </w:t>
+      </w:r>
+      <w:r>
+        <w:t xml:space="preserve">— a workflow even the enterprise suites keep in separate modules.</w:t>
+      </w:r>
+    </w:p>
+    <w:p>
+      <w:pPr>
+        <w:pStyle w:val="Compact"/>
+        <w:numPr>
+          <w:ilvl w:val="0"/>
+          <w:numId w:val="1004"/>
+        </w:numPr>
+      </w:pPr>
+      <w:r>
+        <w:rPr>
+          <w:b/>
+          <w:bCs/>
+        </w:rPr>
+        <w:t xml:space="preserve">Governance on the process, proven by data — and monitored over time.</w:t>
+      </w:r>
+      <w:r>
+        <w:t xml:space="preserve"> </w:t>
+      </w:r>
+      <w:r>
+        <w:t xml:space="preserve">Attach Risks &amp; Controls to the real steps, produce a Risk-Control Matrix, and — uniquely at this tier — see each control’s</w:t>
+      </w:r>
+      <w:r>
+        <w:t xml:space="preserve"> </w:t>
+      </w:r>
+      <w:r>
+        <w:rPr>
+          <w:b/>
+          <w:bCs/>
+        </w:rPr>
+        <w:t xml:space="preserve">operating effectiveness</w:t>
+      </w:r>
+      <w:r>
+        <w:t xml:space="preserve"> </w:t>
+      </w:r>
+      <w:r>
+        <w:t xml:space="preserve">(</w:t>
+      </w:r>
+      <w:r>
+        <w:t xml:space="preserve">“bypassed in N of M cases”</w:t>
+      </w:r>
+      <w:r>
+        <w:t xml:space="preserve">) computed from the</w:t>
+      </w:r>
+      <w:r>
+        <w:t xml:space="preserve"> </w:t>
+      </w:r>
+      <w:r>
+        <w:rPr>
+          <w:i/>
+          <w:iCs/>
+        </w:rPr>
+        <w:t xml:space="preserve">mined conformance</w:t>
+      </w:r>
+      <w:r>
+        <w:t xml:space="preserve">, now</w:t>
+      </w:r>
+      <w:r>
+        <w:t xml:space="preserve"> </w:t>
+      </w:r>
+      <w:r>
+        <w:rPr>
+          <w:b/>
+          <w:bCs/>
+        </w:rPr>
+        <w:t xml:space="preserve">trended organisation-wide over time</w:t>
+      </w:r>
+      <w:r>
+        <w:t xml:space="preserve"> </w:t>
+      </w:r>
+      <w:r>
+        <w:t xml:space="preserve">in a dedicated</w:t>
+      </w:r>
+      <w:r>
+        <w:t xml:space="preserve"> </w:t>
+      </w:r>
+      <w:r>
+        <w:rPr>
+          <w:b/>
+          <w:bCs/>
+        </w:rPr>
+        <w:t xml:space="preserve">Compliance Monitoring</w:t>
+      </w:r>
+      <w:r>
+        <w:t xml:space="preserve"> </w:t>
+      </w:r>
+      <w:r>
+        <w:t xml:space="preserve">console with declining-control alerts. Enterprise GRC suites keep risk/control and process mining in separate products; Diagramatix does both on one model</w:t>
+      </w:r>
+      <w:r>
+        <w:t xml:space="preserve"> </w:t>
+      </w:r>
+      <w:r>
+        <w:rPr>
+          <w:i/>
+          <w:iCs/>
+        </w:rPr>
+        <w:t xml:space="preserve">and</w:t>
+      </w:r>
+      <w:r>
+        <w:t xml:space="preserve"> </w:t>
+      </w:r>
+      <w:r>
+        <w:t xml:space="preserve">monitors compliance continuously.</w:t>
+      </w:r>
+    </w:p>
+    <w:p>
+      <w:pPr>
+        <w:pStyle w:val="Compact"/>
+        <w:numPr>
+          <w:ilvl w:val="0"/>
+          <w:numId w:val="1004"/>
+        </w:numPr>
+      </w:pPr>
+      <w:r>
+        <w:rPr>
+          <w:b/>
+          <w:bCs/>
+        </w:rPr>
+        <w:t xml:space="preserve">Entity-lifecycle mining + state-machine conformance.</w:t>
+      </w:r>
+      <w:r>
+        <w:t xml:space="preserve"> </w:t>
+      </w:r>
+      <w:r>
+        <w:t xml:space="preserve">Beyond directly-follows BPMN discovery, Diagramatix mines the business entity’s</w:t>
+      </w:r>
+      <w:r>
+        <w:t xml:space="preserve"> </w:t>
+      </w:r>
+      <w:r>
+        <w:rPr>
+          <w:b/>
+          <w:bCs/>
+        </w:rPr>
+        <w:t xml:space="preserve">state machine</w:t>
+      </w:r>
+      <w:r>
+        <w:t xml:space="preserve"> </w:t>
+      </w:r>
+      <w:r>
+        <w:t xml:space="preserve">and replays it against a reference lifecycle — conformance framed as</w:t>
+      </w:r>
+      <w:r>
+        <w:t xml:space="preserve"> </w:t>
+      </w:r>
+      <w:r>
+        <w:rPr>
+          <w:i/>
+          <w:iCs/>
+        </w:rPr>
+        <w:t xml:space="preserve">legal states/transitions</w:t>
+      </w:r>
+      <w:r>
+        <w:t xml:space="preserve">, unusually precise for this tier.</w:t>
+      </w:r>
+    </w:p>
+    <w:p>
+      <w:pPr>
+        <w:pStyle w:val="Compact"/>
+        <w:numPr>
+          <w:ilvl w:val="0"/>
+          <w:numId w:val="1004"/>
         </w:numPr>
       </w:pPr>
       <w:r>
@@ -1161,8 +1570,8 @@
         </w:pict>
       </w:r>
     </w:p>
-    <w:bookmarkEnd w:id="12"/>
-    <w:bookmarkStart w:id="13" w:name="high-level-positioning"/>
+    <w:bookmarkEnd w:id="13"/>
+    <w:bookmarkStart w:id="14" w:name="high-level-positioning"/>
     <w:p>
       <w:pPr>
         <w:pStyle w:val="Heading2"/>
@@ -1270,6 +1679,19 @@
               <w:t xml:space="preserve">risk &amp; control + Risk-Control Matrix with mining-proven control effectiveness</w:t>
             </w:r>
             <w:r>
+              <w:t xml:space="preserve">,</w:t>
+            </w:r>
+            <w:r>
+              <w:t xml:space="preserve"> </w:t>
+            </w:r>
+            <w:r>
+              <w:rPr>
+                <w:b/>
+                <w:bCs/>
+              </w:rPr>
+              <w:t xml:space="preserve">continuous org-wide compliance monitoring</w:t>
+            </w:r>
+            <w:r>
               <w:t xml:space="preserve">, health checking</w:t>
             </w:r>
           </w:p>
@@ -1281,7 +1703,7 @@
               <w:pStyle w:val="Compact"/>
             </w:pPr>
             <w:r>
-              <w:t xml:space="preserve">Enterprise-scale mining connectors &amp; org-wide process-intelligence dashboards; deep repository governance at ARIS/Signavio scale</w:t>
+              <w:t xml:space="preserve">Enterprise-scale mining connectors &amp; general org-wide process-intelligence dashboards; deep repository governance at ARIS/Signavio scale</w:t>
             </w:r>
           </w:p>
         </w:tc>
@@ -1411,8 +1833,8 @@
         </w:pict>
       </w:r>
     </w:p>
-    <w:bookmarkEnd w:id="13"/>
-    <w:bookmarkStart w:id="14" w:name="capability-comparison-grouped"/>
+    <w:bookmarkEnd w:id="14"/>
+    <w:bookmarkStart w:id="15" w:name="capability-comparison-grouped"/>
     <w:p>
       <w:pPr>
         <w:pStyle w:val="Heading2"/>
@@ -3172,6 +3594,152 @@
               <w:pStyle w:val="Compact"/>
             </w:pPr>
             <w:r>
+              <w:rPr>
+                <w:b/>
+                <w:bCs/>
+              </w:rPr>
+              <w:t xml:space="preserve">Continuous compliance monitoring — control effectiveness trended over time, org-wide across all projects</w:t>
+            </w:r>
+          </w:p>
+        </w:tc>
+        <w:tc>
+          <w:tcPr/>
+          <w:p>
+            <w:pPr>
+              <w:pStyle w:val="Compact"/>
+            </w:pPr>
+            <w:r>
+              <w:rPr>
+                <w:b/>
+                <w:bCs/>
+              </w:rPr>
+              <w:t xml:space="preserve">Strong</w:t>
+            </w:r>
+            <w:r>
+              <w:t xml:space="preserve"> </w:t>
+            </w:r>
+            <w:r>
+              <w:t xml:space="preserve">(distinctive, integrated)</w:t>
+            </w:r>
+          </w:p>
+        </w:tc>
+        <w:tc>
+          <w:tcPr/>
+          <w:p>
+            <w:pPr>
+              <w:pStyle w:val="Compact"/>
+            </w:pPr>
+            <w:r>
+              <w:t xml:space="preserve">Partial (separate PI + GRC)</w:t>
+            </w:r>
+          </w:p>
+        </w:tc>
+        <w:tc>
+          <w:tcPr/>
+          <w:p>
+            <w:pPr>
+              <w:pStyle w:val="Compact"/>
+            </w:pPr>
+            <w:r>
+              <w:t xml:space="preserve">Partial (separate mining + ARCM)</w:t>
+            </w:r>
+          </w:p>
+        </w:tc>
+        <w:tc>
+          <w:tcPr/>
+          <w:p>
+            <w:pPr>
+              <w:pStyle w:val="Compact"/>
+            </w:pPr>
+            <w:r>
+              <w:t xml:space="preserve">Not found</w:t>
+            </w:r>
+          </w:p>
+        </w:tc>
+      </w:tr>
+      <w:tr>
+        <w:tc>
+          <w:tcPr/>
+          <w:p>
+            <w:pPr>
+              <w:pStyle w:val="Compact"/>
+            </w:pPr>
+            <w:r>
+              <w:rPr>
+                <w:b/>
+                <w:bCs/>
+              </w:rPr>
+              <w:t xml:space="preserve">Org-wide risk/control numbering + SuperAdmin Org Owner</w:t>
+            </w:r>
+          </w:p>
+        </w:tc>
+        <w:tc>
+          <w:tcPr/>
+          <w:p>
+            <w:pPr>
+              <w:pStyle w:val="Compact"/>
+            </w:pPr>
+            <w:r>
+              <w:rPr>
+                <w:b/>
+                <w:bCs/>
+              </w:rPr>
+              <w:t xml:space="preserve">Strong</w:t>
+            </w:r>
+          </w:p>
+        </w:tc>
+        <w:tc>
+          <w:tcPr/>
+          <w:p>
+            <w:pPr>
+              <w:pStyle w:val="Compact"/>
+            </w:pPr>
+            <w:r>
+              <w:t xml:space="preserve">Partial</w:t>
+            </w:r>
+          </w:p>
+        </w:tc>
+        <w:tc>
+          <w:tcPr/>
+          <w:p>
+            <w:pPr>
+              <w:pStyle w:val="Compact"/>
+            </w:pPr>
+            <w:r>
+              <w:rPr>
+                <w:b/>
+                <w:bCs/>
+              </w:rPr>
+              <w:t xml:space="preserve">Strong</w:t>
+            </w:r>
+            <w:r>
+              <w:t xml:space="preserve"> </w:t>
+            </w:r>
+            <w:r>
+              <w:t xml:space="preserve">(repository)</w:t>
+            </w:r>
+          </w:p>
+        </w:tc>
+        <w:tc>
+          <w:tcPr/>
+          <w:p>
+            <w:pPr>
+              <w:pStyle w:val="Compact"/>
+            </w:pPr>
+            <w:r>
+              <w:t xml:space="preserve">Not found</w:t>
+            </w:r>
+          </w:p>
+        </w:tc>
+      </w:tr>
+      <w:tr>
+        <w:tc>
+          <w:tcPr/>
+          <w:p>
+            <w:pPr>
+              <w:pStyle w:val="Compact"/>
+            </w:pPr>
+            <w:r>
               <w:t xml:space="preserve">Enterprise-scale mining connectors (live system extraction)</w:t>
             </w:r>
           </w:p>
@@ -3550,134 +4118,14 @@
         </w:pict>
       </w:r>
     </w:p>
-    <w:bookmarkEnd w:id="14"/>
-    <w:bookmarkStart w:id="15" w:name="where-diagramatix-now-leads"/>
+    <w:bookmarkEnd w:id="15"/>
+    <w:bookmarkStart w:id="16" w:name="where-diagramatix-now-leads"/>
     <w:p>
       <w:pPr>
         <w:pStyle w:val="Heading2"/>
       </w:pPr>
       <w:r>
         <w:t xml:space="preserve">Where Diagramatix now leads</w:t>
-      </w:r>
-    </w:p>
-    <w:p>
-      <w:pPr>
-        <w:pStyle w:val="Compact"/>
-        <w:numPr>
-          <w:ilvl w:val="0"/>
-          <w:numId w:val="1004"/>
-        </w:numPr>
-      </w:pPr>
-      <w:r>
-        <w:rPr>
-          <w:b/>
-          <w:bCs/>
-        </w:rPr>
-        <w:t xml:space="preserve">Mining-proven control effectiveness on one model.</w:t>
-      </w:r>
-      <w:r>
-        <w:t xml:space="preserve"> </w:t>
-      </w:r>
-      <w:r>
-        <w:t xml:space="preserve">Risks/controls sit on the same process the mining engine analyses, so the Risk-Control Matrix shows whether each control actually</w:t>
-      </w:r>
-      <w:r>
-        <w:t xml:space="preserve"> </w:t>
-      </w:r>
-      <w:r>
-        <w:rPr>
-          <w:i/>
-          <w:iCs/>
-        </w:rPr>
-        <w:t xml:space="preserve">operates</w:t>
-      </w:r>
-      <w:r>
-        <w:t xml:space="preserve"> </w:t>
-      </w:r>
-      <w:r>
-        <w:t xml:space="preserve">(</w:t>
-      </w:r>
-      <w:r>
-        <w:t xml:space="preserve">“bypassed in N of M cases”</w:t>
-      </w:r>
-      <w:r>
-        <w:t xml:space="preserve">) — the enterprise suites keep GRC and process mining in separate products.</w:t>
-      </w:r>
-    </w:p>
-    <w:p>
-      <w:pPr>
-        <w:pStyle w:val="Compact"/>
-        <w:numPr>
-          <w:ilvl w:val="0"/>
-          <w:numId w:val="1004"/>
-        </w:numPr>
-      </w:pPr>
-      <w:r>
-        <w:rPr>
-          <w:b/>
-          <w:bCs/>
-        </w:rPr>
-        <w:t xml:space="preserve">The integrated loop.</w:t>
-      </w:r>
-      <w:r>
-        <w:t xml:space="preserve"> </w:t>
-      </w:r>
-      <w:r>
-        <w:t xml:space="preserve">Mining output feeds a calibrated simulation twin in one click — discovery, conformance and simulation aren’t separate modules with separate effort.</w:t>
-      </w:r>
-    </w:p>
-    <w:p>
-      <w:pPr>
-        <w:pStyle w:val="Compact"/>
-        <w:numPr>
-          <w:ilvl w:val="0"/>
-          <w:numId w:val="1004"/>
-        </w:numPr>
-      </w:pPr>
-      <w:r>
-        <w:rPr>
-          <w:b/>
-          <w:bCs/>
-        </w:rPr>
-        <w:t xml:space="preserve">Entity-lifecycle conformance.</w:t>
-      </w:r>
-      <w:r>
-        <w:t xml:space="preserve"> </w:t>
-      </w:r>
-      <w:r>
-        <w:t xml:space="preserve">State-machine discovery + replay against a reference lifecycle (legal states/transitions) is more precise than DFG-only conformance and rare at this tier.</w:t>
-      </w:r>
-    </w:p>
-    <w:p>
-      <w:pPr>
-        <w:pStyle w:val="Compact"/>
-        <w:numPr>
-          <w:ilvl w:val="0"/>
-          <w:numId w:val="1004"/>
-        </w:numPr>
-      </w:pPr>
-      <w:r>
-        <w:rPr>
-          <w:b/>
-          <w:bCs/>
-        </w:rPr>
-        <w:t xml:space="preserve">Input breadth + self-service economics.</w:t>
-      </w:r>
-      <w:r>
-        <w:t xml:space="preserve"> </w:t>
-      </w:r>
-      <w:r>
-        <w:t xml:space="preserve">Text, image and voice to diagram across every notation; Visio round-trip both directions; free tier + self-serve upgrade vs enterprise sales motions.</w:t>
-      </w:r>
-    </w:p>
-    <w:bookmarkEnd w:id="15"/>
-    <w:bookmarkStart w:id="16" w:name="Xc5c32f78889ee5584ab9078a5332f3e65567679"/>
-    <w:p>
-      <w:pPr>
-        <w:pStyle w:val="Heading2"/>
-      </w:pPr>
-      <w:r>
-        <w:t xml:space="preserve">Where Diagramatix still trails (honest gaps)</w:t>
       </w:r>
     </w:p>
     <w:p>
@@ -3693,13 +4141,35 @@
           <w:b/>
           <w:bCs/>
         </w:rPr>
-        <w:t xml:space="preserve">Enterprise mining at scale.</w:t>
-      </w:r>
-      <w:r>
-        <w:t xml:space="preserve"> </w:t>
-      </w:r>
-      <w:r>
-        <w:t xml:space="preserve">Diagramatix mines uploaded event logs; Celonis/Signavio PI/ARIS extract live from source systems (SAP, ServiceNow…) with pre-built connectors and org-wide dashboards.</w:t>
+        <w:t xml:space="preserve">Mining-proven control effectiveness on one model.</w:t>
+      </w:r>
+      <w:r>
+        <w:t xml:space="preserve"> </w:t>
+      </w:r>
+      <w:r>
+        <w:t xml:space="preserve">Risks/controls sit on the same process the mining engine analyses, so the Risk-Control Matrix shows whether each control actually</w:t>
+      </w:r>
+      <w:r>
+        <w:t xml:space="preserve"> </w:t>
+      </w:r>
+      <w:r>
+        <w:rPr>
+          <w:i/>
+          <w:iCs/>
+        </w:rPr>
+        <w:t xml:space="preserve">operates</w:t>
+      </w:r>
+      <w:r>
+        <w:t xml:space="preserve"> </w:t>
+      </w:r>
+      <w:r>
+        <w:t xml:space="preserve">(</w:t>
+      </w:r>
+      <w:r>
+        <w:t xml:space="preserve">“bypassed in N of M cases”</w:t>
+      </w:r>
+      <w:r>
+        <w:t xml:space="preserve">) — the enterprise suites keep GRC and process mining in separate products.</w:t>
       </w:r>
     </w:p>
     <w:p>
@@ -3715,13 +4185,29 @@
           <w:b/>
           <w:bCs/>
         </w:rPr>
-        <w:t xml:space="preserve">Repository governance.</w:t>
-      </w:r>
-      <w:r>
-        <w:t xml:space="preserve"> </w:t>
-      </w:r>
-      <w:r>
-        <w:t xml:space="preserve">ARIS/Signavio offer deep repository objects, glossaries, lifecycle governance and enterprise access control beyond project sharing.</w:t>
+        <w:t xml:space="preserve">Continuous, org-wide compliance monitoring.</w:t>
+      </w:r>
+      <w:r>
+        <w:t xml:space="preserve"> </w:t>
+      </w:r>
+      <w:r>
+        <w:t xml:space="preserve">The Compliance Monitoring console trends each control’s operating-effectiveness</w:t>
+      </w:r>
+      <w:r>
+        <w:t xml:space="preserve"> </w:t>
+      </w:r>
+      <w:r>
+        <w:rPr>
+          <w:i/>
+          <w:iCs/>
+        </w:rPr>
+        <w:t xml:space="preserve">over time</w:t>
+      </w:r>
+      <w:r>
+        <w:t xml:space="preserve"> </w:t>
+      </w:r>
+      <w:r>
+        <w:t xml:space="preserve">across every project in the organisation, with declining-control and below-threshold alerts and a by-project posture view — governance as an ongoing monitor, not a one-off matrix. Enterprise suites provide this only by stitching a process-intelligence product to a separate GRC product.</w:t>
       </w:r>
     </w:p>
     <w:p>
@@ -3737,42 +4223,67 @@
           <w:b/>
           <w:bCs/>
         </w:rPr>
-        <w:t xml:space="preserve">Org-wide analytics surface.</w:t>
-      </w:r>
-      <w:r>
-        <w:t xml:space="preserve"> </w:t>
-      </w:r>
-      <w:r>
-        <w:t xml:space="preserve">No org-wide KPI / process-intelligence dashboarding layer (yet).</w:t>
-      </w:r>
-    </w:p>
-    <w:p>
-      <w:pPr>
-        <w:pStyle w:val="FirstParagraph"/>
-      </w:pPr>
-      <w:r>
-        <w:rPr>
-          <w:i/>
-          <w:iCs/>
-        </w:rPr>
-        <w:t xml:space="preserve">(Risk/compliance is no longer a gap — see the GRC rows above.)</w:t>
-      </w:r>
-    </w:p>
-    <w:p>
-      <w:r>
-        <w:pict>
-          <v:rect style="width:0;height:1.5pt" o:hralign="center" o:hrstd="t" o:hr="t"/>
-        </w:pict>
+        <w:t xml:space="preserve">The integrated loop.</w:t>
+      </w:r>
+      <w:r>
+        <w:t xml:space="preserve"> </w:t>
+      </w:r>
+      <w:r>
+        <w:t xml:space="preserve">Mining output feeds a calibrated simulation twin in one click — discovery, conformance and simulation aren’t separate modules with separate effort.</w:t>
+      </w:r>
+    </w:p>
+    <w:p>
+      <w:pPr>
+        <w:pStyle w:val="Compact"/>
+        <w:numPr>
+          <w:ilvl w:val="0"/>
+          <w:numId w:val="1005"/>
+        </w:numPr>
+      </w:pPr>
+      <w:r>
+        <w:rPr>
+          <w:b/>
+          <w:bCs/>
+        </w:rPr>
+        <w:t xml:space="preserve">Entity-lifecycle conformance.</w:t>
+      </w:r>
+      <w:r>
+        <w:t xml:space="preserve"> </w:t>
+      </w:r>
+      <w:r>
+        <w:t xml:space="preserve">State-machine discovery + replay against a reference lifecycle (legal states/transitions) is more precise than DFG-only conformance and rare at this tier.</w:t>
+      </w:r>
+    </w:p>
+    <w:p>
+      <w:pPr>
+        <w:pStyle w:val="Compact"/>
+        <w:numPr>
+          <w:ilvl w:val="0"/>
+          <w:numId w:val="1005"/>
+        </w:numPr>
+      </w:pPr>
+      <w:r>
+        <w:rPr>
+          <w:b/>
+          <w:bCs/>
+        </w:rPr>
+        <w:t xml:space="preserve">Input breadth + self-service economics.</w:t>
+      </w:r>
+      <w:r>
+        <w:t xml:space="preserve"> </w:t>
+      </w:r>
+      <w:r>
+        <w:t xml:space="preserve">Text, image and voice to diagram across every notation; Visio round-trip both directions; free tier + self-serve upgrade vs enterprise sales motions.</w:t>
       </w:r>
     </w:p>
     <w:bookmarkEnd w:id="16"/>
-    <w:bookmarkStart w:id="17" w:name="recommended-positioning-statements"/>
+    <w:bookmarkStart w:id="17" w:name="Xc5c32f78889ee5584ab9078a5332f3e65567679"/>
     <w:p>
       <w:pPr>
         <w:pStyle w:val="Heading2"/>
       </w:pPr>
       <w:r>
-        <w:t xml:space="preserve">Recommended positioning statements</w:t>
+        <w:t xml:space="preserve">Where Diagramatix still trails (honest gaps)</w:t>
       </w:r>
     </w:p>
     <w:p>
@@ -3788,13 +4299,13 @@
           <w:b/>
           <w:bCs/>
         </w:rPr>
-        <w:t xml:space="preserve">vs Signavio/ARIS:</w:t>
-      </w:r>
-      <w:r>
-        <w:t xml:space="preserve"> </w:t>
-      </w:r>
-      <w:r>
-        <w:t xml:space="preserve">“The full model-to-mine-to-govern-to-simulate loop, self-service, without the enterprise stack or the enterprise bill — with control effectiveness proven from your own event data on the same model.”</w:t>
+        <w:t xml:space="preserve">Enterprise mining at scale.</w:t>
+      </w:r>
+      <w:r>
+        <w:t xml:space="preserve"> </w:t>
+      </w:r>
+      <w:r>
+        <w:t xml:space="preserve">Diagramatix mines uploaded event logs; Celonis/Signavio PI/ARIS extract live from source systems (SAP, ServiceNow…) with pre-built connectors and org-wide dashboards.</w:t>
       </w:r>
     </w:p>
     <w:p>
@@ -3810,29 +4321,13 @@
           <w:b/>
           <w:bCs/>
         </w:rPr>
-        <w:t xml:space="preserve">vs Celonis:</w:t>
-      </w:r>
-      <w:r>
-        <w:t xml:space="preserve"> </w:t>
-      </w:r>
-      <w:r>
-        <w:t xml:space="preserve">“Bring your event log; get discovery, conformance, a runnable digital twin</w:t>
-      </w:r>
-      <w:r>
-        <w:t xml:space="preserve"> </w:t>
-      </w:r>
-      <w:r>
-        <w:rPr>
-          <w:b/>
-          <w:bCs/>
-        </w:rPr>
-        <w:t xml:space="preserve">and</w:t>
-      </w:r>
-      <w:r>
-        <w:t xml:space="preserve"> </w:t>
-      </w:r>
-      <w:r>
-        <w:t xml:space="preserve">a Risk-Control Matrix that shows which controls were bypassed — not just a dashboard.”</w:t>
+        <w:t xml:space="preserve">Repository governance.</w:t>
+      </w:r>
+      <w:r>
+        <w:t xml:space="preserve"> </w:t>
+      </w:r>
+      <w:r>
+        <w:t xml:space="preserve">ARIS/Signavio offer deep repository objects, glossaries, lifecycle governance and enterprise access control beyond project sharing.</w:t>
       </w:r>
     </w:p>
     <w:p>
@@ -3848,13 +4343,57 @@
           <w:b/>
           <w:bCs/>
         </w:rPr>
-        <w:t xml:space="preserve">vs PRIME BPM:</w:t>
-      </w:r>
-      <w:r>
-        <w:t xml:space="preserve"> </w:t>
-      </w:r>
-      <w:r>
-        <w:t xml:space="preserve">“Everything PRIME does for BPMN improvement, plus real process mining, conformance, digital-twin simulation and a data-proven Risk-Control Matrix.”</w:t>
+        <w:t xml:space="preserve">Org-wide analytics surface (general process intelligence).</w:t>
+      </w:r>
+      <w:r>
+        <w:t xml:space="preserve"> </w:t>
+      </w:r>
+      <w:r>
+        <w:t xml:space="preserve">For</w:t>
+      </w:r>
+      <w:r>
+        <w:t xml:space="preserve"> </w:t>
+      </w:r>
+      <w:r>
+        <w:rPr>
+          <w:b/>
+          <w:bCs/>
+        </w:rPr>
+        <w:t xml:space="preserve">compliance</w:t>
+      </w:r>
+      <w:r>
+        <w:t xml:space="preserve"> </w:t>
+      </w:r>
+      <w:r>
+        <w:t xml:space="preserve">specifically this is now covered — the Compliance Monitoring console trends control effectiveness org-wide across projects. A general</w:t>
+      </w:r>
+      <w:r>
+        <w:t xml:space="preserve"> </w:t>
+      </w:r>
+      <w:r>
+        <w:rPr>
+          <w:b/>
+          <w:bCs/>
+        </w:rPr>
+        <w:t xml:space="preserve">process-intelligence KPI dashboard</w:t>
+      </w:r>
+      <w:r>
+        <w:t xml:space="preserve"> </w:t>
+      </w:r>
+      <w:r>
+        <w:t xml:space="preserve">(throughput, cycle-time and cost analytics across the whole organisation, live) is still not present.</w:t>
+      </w:r>
+    </w:p>
+    <w:p>
+      <w:pPr>
+        <w:pStyle w:val="FirstParagraph"/>
+      </w:pPr>
+      <w:r>
+        <w:rPr>
+          <w:i/>
+          <w:iCs/>
+        </w:rPr>
+        <w:t xml:space="preserve">(Risk/compliance is no longer a gap — see the GRC rows above; org-wide compliance trending is now shipped.)</w:t>
       </w:r>
     </w:p>
     <w:p>
@@ -3864,6 +4403,127 @@
         </w:pict>
       </w:r>
     </w:p>
+    <w:bookmarkEnd w:id="17"/>
+    <w:bookmarkStart w:id="18" w:name="recommended-positioning-statements"/>
+    <w:p>
+      <w:pPr>
+        <w:pStyle w:val="Heading2"/>
+      </w:pPr>
+      <w:r>
+        <w:t xml:space="preserve">Recommended positioning statements</w:t>
+      </w:r>
+    </w:p>
+    <w:p>
+      <w:pPr>
+        <w:pStyle w:val="Compact"/>
+        <w:numPr>
+          <w:ilvl w:val="0"/>
+          <w:numId w:val="1007"/>
+        </w:numPr>
+      </w:pPr>
+      <w:r>
+        <w:rPr>
+          <w:b/>
+          <w:bCs/>
+        </w:rPr>
+        <w:t xml:space="preserve">vs Signavio/ARIS:</w:t>
+      </w:r>
+      <w:r>
+        <w:t xml:space="preserve"> </w:t>
+      </w:r>
+      <w:r>
+        <w:t xml:space="preserve">“The full model-to-mine-to-govern-to-simulate loop, self-service, without the enterprise stack or the enterprise bill — with control effectiveness proven from your own event data on the same model, and monitored organisation-wide over time.”</w:t>
+      </w:r>
+    </w:p>
+    <w:p>
+      <w:pPr>
+        <w:pStyle w:val="Compact"/>
+        <w:numPr>
+          <w:ilvl w:val="0"/>
+          <w:numId w:val="1007"/>
+        </w:numPr>
+      </w:pPr>
+      <w:r>
+        <w:rPr>
+          <w:b/>
+          <w:bCs/>
+        </w:rPr>
+        <w:t xml:space="preserve">vs Celonis:</w:t>
+      </w:r>
+      <w:r>
+        <w:t xml:space="preserve"> </w:t>
+      </w:r>
+      <w:r>
+        <w:t xml:space="preserve">“Bring your event log; get discovery, conformance, a runnable digital twin</w:t>
+      </w:r>
+      <w:r>
+        <w:t xml:space="preserve"> </w:t>
+      </w:r>
+      <w:r>
+        <w:rPr>
+          <w:b/>
+          <w:bCs/>
+        </w:rPr>
+        <w:t xml:space="preserve">and</w:t>
+      </w:r>
+      <w:r>
+        <w:t xml:space="preserve"> </w:t>
+      </w:r>
+      <w:r>
+        <w:t xml:space="preserve">a Risk-Control Matrix that shows which controls were bypassed — not just a dashboard.”</w:t>
+      </w:r>
+    </w:p>
+    <w:p>
+      <w:pPr>
+        <w:pStyle w:val="Compact"/>
+        <w:numPr>
+          <w:ilvl w:val="0"/>
+          <w:numId w:val="1007"/>
+        </w:numPr>
+      </w:pPr>
+      <w:r>
+        <w:rPr>
+          <w:b/>
+          <w:bCs/>
+        </w:rPr>
+        <w:t xml:space="preserve">vs PRIME BPM:</w:t>
+      </w:r>
+      <w:r>
+        <w:t xml:space="preserve"> </w:t>
+      </w:r>
+      <w:r>
+        <w:t xml:space="preserve">“Everything PRIME does for BPMN improvement, plus real process mining, conformance, digital-twin simulation and a data-proven Risk-Control Matrix.”</w:t>
+      </w:r>
+    </w:p>
+    <w:p>
+      <w:pPr>
+        <w:pStyle w:val="Compact"/>
+        <w:numPr>
+          <w:ilvl w:val="0"/>
+          <w:numId w:val="1007"/>
+        </w:numPr>
+      </w:pPr>
+      <w:r>
+        <w:rPr>
+          <w:b/>
+          <w:bCs/>
+        </w:rPr>
+        <w:t xml:space="preserve">On compliance:</w:t>
+      </w:r>
+      <w:r>
+        <w:t xml:space="preserve"> </w:t>
+      </w:r>
+      <w:r>
+        <w:t xml:space="preserve">“Not just a Risk-Control Matrix — a live compliance monitor that trends whether your controls keep operating, organisation-wide, from your own event data, and flags the ones sliding below threshold.”</w:t>
+      </w:r>
+    </w:p>
+    <w:p>
+      <w:r>
+        <w:pict>
+          <v:rect style="width:0;height:1.5pt" o:hralign="center" o:hrstd="t" o:hr="t"/>
+        </w:pict>
+      </w:r>
+    </w:p>
     <w:p>
       <w:pPr>
         <w:pStyle w:val="FirstParagraph"/>
@@ -3873,7 +4533,7 @@
           <w:i/>
           <w:iCs/>
         </w:rPr>
-        <w:t xml:space="preserve">Assessments reflect public product material as of July 2026 and the current Diagramatix feature catalogue.</w:t>
+        <w:t xml:space="preserve">Assessments reflect public product material as of 7 July 2026 and the current Diagramatix feature catalogue.</w:t>
       </w:r>
       <w:r>
         <w:rPr>
@@ -3901,11 +4561,11 @@
           <w:i/>
           <w:iCs/>
         </w:rPr>
-        <w:t xml:space="preserve">indicates no confirmed public evidence, not proven absence. Competitor GRC cells (SAP GRC / ARIS ARCM) reflect documented enterprise modules and warrant a human verification pass before external use.</w:t>
-      </w:r>
-    </w:p>
-    <w:bookmarkEnd w:id="17"/>
+        <w:t xml:space="preserve">indicates no confirmed public evidence, not proven absence. Competitor GRC / process-intelligence cells (SAP GRC + Signavio PI / ARIS ARCM + ARIS Mining) reflect documented enterprise modules and warrant a human verification pass before external use.</w:t>
+      </w:r>
+    </w:p>
     <w:bookmarkEnd w:id="18"/>
+    <w:bookmarkEnd w:id="19"/>
     <w:sectPr>
       <w:footnotePr>
         <w:numRestart w:val="eachSect"/>
@@ -4217,34 +4877,7 @@
     <w:abstractNumId w:val="991"/>
   </w:num>
   <w:num w:numId="1004">
-    <w:abstractNumId w:val="99411"/>
-    <w:lvlOverride w:ilvl="0">
-      <w:startOverride w:val="1"/>
-    </w:lvlOverride>
-    <w:lvlOverride w:ilvl="1">
-      <w:startOverride w:val="1"/>
-    </w:lvlOverride>
-    <w:lvlOverride w:ilvl="2">
-      <w:startOverride w:val="1"/>
-    </w:lvlOverride>
-    <w:lvlOverride w:ilvl="3">
-      <w:startOverride w:val="1"/>
-    </w:lvlOverride>
-    <w:lvlOverride w:ilvl="4">
-      <w:startOverride w:val="1"/>
-    </w:lvlOverride>
-    <w:lvlOverride w:ilvl="5">
-      <w:startOverride w:val="1"/>
-    </w:lvlOverride>
-    <w:lvlOverride w:ilvl="6">
-      <w:startOverride w:val="1"/>
-    </w:lvlOverride>
-    <w:lvlOverride w:ilvl="7">
-      <w:startOverride w:val="1"/>
-    </w:lvlOverride>
-    <w:lvlOverride w:ilvl="8">
-      <w:startOverride w:val="1"/>
-    </w:lvlOverride>
+    <w:abstractNumId w:val="991"/>
   </w:num>
   <w:num w:numId="1005">
     <w:abstractNumId w:val="99411"/>
@@ -4277,6 +4910,36 @@
     </w:lvlOverride>
   </w:num>
   <w:num w:numId="1006">
+    <w:abstractNumId w:val="99411"/>
+    <w:lvlOverride w:ilvl="0">
+      <w:startOverride w:val="1"/>
+    </w:lvlOverride>
+    <w:lvlOverride w:ilvl="1">
+      <w:startOverride w:val="1"/>
+    </w:lvlOverride>
+    <w:lvlOverride w:ilvl="2">
+      <w:startOverride w:val="1"/>
+    </w:lvlOverride>
+    <w:lvlOverride w:ilvl="3">
+      <w:startOverride w:val="1"/>
+    </w:lvlOverride>
+    <w:lvlOverride w:ilvl="4">
+      <w:startOverride w:val="1"/>
+    </w:lvlOverride>
+    <w:lvlOverride w:ilvl="5">
+      <w:startOverride w:val="1"/>
+    </w:lvlOverride>
+    <w:lvlOverride w:ilvl="6">
+      <w:startOverride w:val="1"/>
+    </w:lvlOverride>
+    <w:lvlOverride w:ilvl="7">
+      <w:startOverride w:val="1"/>
+    </w:lvlOverride>
+    <w:lvlOverride w:ilvl="8">
+      <w:startOverride w:val="1"/>
+    </w:lvlOverride>
+  </w:num>
+  <w:num w:numId="1007">
     <w:abstractNumId w:val="991"/>
   </w:num>
 </w:numbering>

</xml_diff>